<commit_message>
generation templates have been corrected
</commit_message>
<xml_diff>
--- a/templates/docxRPD/matrix.docx
+++ b/templates/docxRPD/matrix.docx
@@ -650,7 +650,6 @@
           <w14:ligatures w14:val="none"/>
         </w:rPr>
       </w:pPr>
-      <w:proofErr w:type="gramStart"/>
       <w:r>
         <w:rPr>
           <w:rFonts w:cs="Times New Roman"/>
@@ -672,7 +671,6 @@
         </w:rPr>
         <w:t>direction</w:t>
       </w:r>
-      <w:proofErr w:type="gramEnd"/>
       <w:r>
         <w:rPr>
           <w:rFonts w:cs="Times New Roman"/>
@@ -683,7 +681,6 @@
         </w:rPr>
         <w:t>_</w:t>
       </w:r>
-      <w:proofErr w:type="gramStart"/>
       <w:r>
         <w:rPr>
           <w:rFonts w:cs="Times New Roman"/>
@@ -703,9 +700,8 @@
           <w:sz w:val="24"/>
           <w:szCs w:val="24"/>
         </w:rPr>
-        <w:t xml:space="preserve"> }</w:t>
-      </w:r>
-      <w:proofErr w:type="gramEnd"/>
+        <w:t xml:space="preserve"> }} {{ </w:t>
+      </w:r>
       <w:r>
         <w:rPr>
           <w:rFonts w:cs="Times New Roman"/>
@@ -713,32 +709,10 @@
           <w:bCs/>
           <w:sz w:val="24"/>
           <w:szCs w:val="24"/>
-        </w:rPr>
-        <w:t xml:space="preserve">} </w:t>
-      </w:r>
-      <w:proofErr w:type="gramStart"/>
-      <w:r>
-        <w:rPr>
-          <w:rFonts w:cs="Times New Roman"/>
-          <w:b/>
-          <w:bCs/>
-          <w:sz w:val="24"/>
-          <w:szCs w:val="24"/>
-        </w:rPr>
-        <w:t xml:space="preserve">{{ </w:t>
-      </w:r>
-      <w:r>
-        <w:rPr>
-          <w:rFonts w:cs="Times New Roman"/>
-          <w:b/>
-          <w:bCs/>
-          <w:sz w:val="24"/>
-          <w:szCs w:val="24"/>
           <w:lang w:val="en-US"/>
         </w:rPr>
         <w:t>direction</w:t>
       </w:r>
-      <w:proofErr w:type="gramEnd"/>
       <w:r>
         <w:rPr>
           <w:rFonts w:cs="Times New Roman"/>
@@ -945,7 +919,6 @@
           <w14:ligatures w14:val="none"/>
         </w:rPr>
       </w:pPr>
-      <w:proofErr w:type="gramStart"/>
       <w:r>
         <w:rPr>
           <w:rFonts w:cs="Times New Roman"/>
@@ -967,7 +940,6 @@
         </w:rPr>
         <w:t>spec</w:t>
       </w:r>
-      <w:proofErr w:type="gramEnd"/>
       <w:r>
         <w:rPr>
           <w:rFonts w:cs="Times New Roman"/>
@@ -978,7 +950,6 @@
         </w:rPr>
         <w:t>_</w:t>
       </w:r>
-      <w:proofErr w:type="gramStart"/>
       <w:r>
         <w:rPr>
           <w:rFonts w:cs="Times New Roman"/>
@@ -998,18 +969,7 @@
           <w:sz w:val="24"/>
           <w:szCs w:val="24"/>
         </w:rPr>
-        <w:t xml:space="preserve"> }</w:t>
-      </w:r>
-      <w:proofErr w:type="gramEnd"/>
-      <w:r>
-        <w:rPr>
-          <w:rFonts w:cs="Times New Roman"/>
-          <w:b/>
-          <w:bCs/>
-          <w:sz w:val="24"/>
-          <w:szCs w:val="24"/>
-        </w:rPr>
-        <w:t>}</w:t>
+        <w:t xml:space="preserve"> }}</w:t>
       </w:r>
     </w:p>
     <w:p>
@@ -1186,7 +1146,6 @@
           <w14:ligatures w14:val="none"/>
         </w:rPr>
       </w:pPr>
-      <w:proofErr w:type="gramStart"/>
       <w:r>
         <w:rPr>
           <w:rFonts w:cs="Times New Roman"/>
@@ -1197,7 +1156,6 @@
         </w:rPr>
         <w:t xml:space="preserve">{{ </w:t>
       </w:r>
-      <w:proofErr w:type="spellStart"/>
       <w:r>
         <w:rPr>
           <w:rFonts w:cs="Times New Roman"/>
@@ -1209,8 +1167,6 @@
         </w:rPr>
         <w:t>kvalif</w:t>
       </w:r>
-      <w:proofErr w:type="spellEnd"/>
-      <w:proofErr w:type="gramEnd"/>
       <w:r>
         <w:rPr>
           <w:rFonts w:cs="Times New Roman"/>
@@ -1375,7 +1331,6 @@
           <w14:ligatures w14:val="none"/>
         </w:rPr>
       </w:pPr>
-      <w:proofErr w:type="gramStart"/>
       <w:r>
         <w:rPr>
           <w:rFonts w:cs="Times New Roman"/>
@@ -1397,7 +1352,6 @@
         </w:rPr>
         <w:t>fob</w:t>
       </w:r>
-      <w:proofErr w:type="gramEnd"/>
       <w:r>
         <w:rPr>
           <w:rFonts w:cs="Times New Roman"/>
@@ -1786,7 +1740,6 @@
         </w:rPr>
         <w:t xml:space="preserve"> </w:t>
       </w:r>
-      <w:proofErr w:type="gramStart"/>
       <w:r>
         <w:rPr>
           <w:rFonts w:cs="Times New Roman"/>
@@ -1808,7 +1761,6 @@
         </w:rPr>
         <w:t>year</w:t>
       </w:r>
-      <w:proofErr w:type="gramEnd"/>
       <w:r>
         <w:rPr>
           <w:rFonts w:cs="Times New Roman"/>
@@ -1819,7 +1771,6 @@
         </w:rPr>
         <w:t>_</w:t>
       </w:r>
-      <w:proofErr w:type="gramStart"/>
       <w:r>
         <w:rPr>
           <w:rFonts w:cs="Times New Roman"/>
@@ -1839,18 +1790,7 @@
           <w:color w:val="000000" w:themeColor="text1"/>
           <w:sz w:val="24"/>
         </w:rPr>
-        <w:t xml:space="preserve"> }</w:t>
-      </w:r>
-      <w:proofErr w:type="gramEnd"/>
-      <w:r>
-        <w:rPr>
-          <w:rFonts w:cs="Times New Roman"/>
-          <w:b/>
-          <w:bCs/>
-          <w:color w:val="000000" w:themeColor="text1"/>
-          <w:sz w:val="24"/>
-        </w:rPr>
-        <w:t>}</w:t>
+        <w:t xml:space="preserve"> }}</w:t>
       </w:r>
     </w:p>
     <w:p>
@@ -2016,17 +1956,14 @@
         </w:rPr>
         <w:t xml:space="preserve"> </w:t>
       </w:r>
-      <w:proofErr w:type="gramStart"/>
       <w:r>
         <w:rPr>
           <w:rFonts w:cs="Times New Roman"/>
           <w:color w:val="000000" w:themeColor="text1"/>
           <w:sz w:val="24"/>
-          <w:lang w:val="en-US"/>
         </w:rPr>
         <w:t xml:space="preserve">{{ </w:t>
       </w:r>
-      <w:proofErr w:type="spellStart"/>
       <w:r>
         <w:rPr>
           <w:rFonts w:cs="Times New Roman"/>
@@ -2036,17 +1973,14 @@
         </w:rPr>
         <w:t>protocol</w:t>
       </w:r>
-      <w:proofErr w:type="gramEnd"/>
       <w:r>
         <w:rPr>
           <w:rFonts w:cs="Times New Roman"/>
           <w:color w:val="000000" w:themeColor="text1"/>
           <w:sz w:val="24"/>
-          <w:lang w:val="en-US"/>
         </w:rPr>
         <w:t>_</w:t>
       </w:r>
-      <w:proofErr w:type="gramStart"/>
       <w:r>
         <w:rPr>
           <w:rFonts w:cs="Times New Roman"/>
@@ -2056,25 +1990,13 @@
         </w:rPr>
         <w:t>year</w:t>
       </w:r>
-      <w:proofErr w:type="spellEnd"/>
       <w:r>
         <w:rPr>
           <w:rFonts w:cs="Times New Roman"/>
           <w:color w:val="000000" w:themeColor="text1"/>
           <w:sz w:val="24"/>
-          <w:lang w:val="en-US"/>
-        </w:rPr>
-        <w:t xml:space="preserve"> }</w:t>
-      </w:r>
-      <w:proofErr w:type="gramEnd"/>
-      <w:r>
-        <w:rPr>
-          <w:rFonts w:cs="Times New Roman"/>
-          <w:color w:val="000000" w:themeColor="text1"/>
-          <w:sz w:val="24"/>
-          <w:lang w:val="en-US"/>
-        </w:rPr>
-        <w:t>}</w:t>
+        </w:rPr>
+        <w:t xml:space="preserve"> }}</w:t>
       </w:r>
       <w:r>
         <w:rPr>
@@ -2244,7 +2166,25 @@
                 <w:szCs w:val="24"/>
                 <w:lang w:val="en-US"/>
               </w:rPr>
-              <w:t xml:space="preserve">{%tr for item in </w:t>
+              <w:t xml:space="preserve">{%tr for </w:t>
+            </w:r>
+            <w:r>
+              <w:rPr>
+                <w:rFonts w:cs="Times New Roman"/>
+                <w:sz w:val="24"/>
+                <w:szCs w:val="24"/>
+                <w:lang w:val="en-US"/>
+              </w:rPr>
+              <w:t>group</w:t>
+            </w:r>
+            <w:r>
+              <w:rPr>
+                <w:rFonts w:cs="Times New Roman"/>
+                <w:sz w:val="24"/>
+                <w:szCs w:val="24"/>
+                <w:lang w:val="en-US"/>
+              </w:rPr>
+              <w:t xml:space="preserve"> in </w:t>
             </w:r>
             <w:r>
               <w:rPr>
@@ -2254,6 +2194,269 @@
                 <w:lang w:val="en-US"/>
               </w:rPr>
               <w:t>matrix</w:t>
+            </w:r>
+            <w:r>
+              <w:rPr>
+                <w:rFonts w:cs="Times New Roman"/>
+                <w:sz w:val="24"/>
+                <w:szCs w:val="24"/>
+                <w:lang w:val="en-US"/>
+              </w:rPr>
+              <w:t>%}</w:t>
+            </w:r>
+            <w:r>
+              <w:rPr>
+                <w:rFonts w:cs="Times New Roman"/>
+                <w:sz w:val="24"/>
+                <w:szCs w:val="24"/>
+                <w:lang w:val="en-US"/>
+              </w:rPr>
+              <w:t xml:space="preserve"> </w:t>
+            </w:r>
+          </w:p>
+        </w:tc>
+      </w:tr>
+      <w:tr>
+        <w:tc>
+          <w:tcPr>
+            <w:tcW w:w="2537" w:type="dxa"/>
+            <w:shd w:val="clear" w:color="auto" w:fill="D0CECE" w:themeFill="background2" w:themeFillShade="E6"/>
+          </w:tcPr>
+          <w:p>
+            <w:pPr>
+              <w:ind w:firstLine="0"/>
+              <w:rPr>
+                <w:rFonts w:cs="Times New Roman"/>
+                <w:sz w:val="24"/>
+                <w:szCs w:val="24"/>
+                <w:lang w:val="en-US"/>
+              </w:rPr>
+            </w:pPr>
+            <w:r>
+              <w:rPr>
+                <w:rFonts w:cs="Times New Roman"/>
+                <w:sz w:val="24"/>
+                <w:szCs w:val="24"/>
+                <w:lang w:val="en-US"/>
+              </w:rPr>
+              <w:t>{{</w:t>
+            </w:r>
+            <w:r>
+              <w:rPr>
+                <w:rFonts w:cs="Times New Roman"/>
+                <w:sz w:val="24"/>
+                <w:szCs w:val="24"/>
+                <w:lang w:val="en-US"/>
+              </w:rPr>
+              <w:t xml:space="preserve"> </w:t>
+            </w:r>
+            <w:r>
+              <w:rPr>
+                <w:rFonts w:cs="Times New Roman"/>
+                <w:sz w:val="24"/>
+                <w:szCs w:val="24"/>
+                <w:lang w:val="en-US"/>
+              </w:rPr>
+              <w:t>group</w:t>
+            </w:r>
+            <w:r>
+              <w:rPr>
+                <w:rFonts w:cs="Times New Roman"/>
+                <w:sz w:val="24"/>
+                <w:szCs w:val="24"/>
+                <w:lang w:val="en-US"/>
+              </w:rPr>
+              <w:t>.discipline_index</w:t>
+            </w:r>
+            <w:r>
+              <w:rPr>
+                <w:rFonts w:cs="Times New Roman"/>
+                <w:sz w:val="24"/>
+                <w:szCs w:val="24"/>
+                <w:lang w:val="en-US"/>
+              </w:rPr>
+              <w:t xml:space="preserve"> }}</w:t>
+            </w:r>
+          </w:p>
+        </w:tc>
+        <w:tc>
+          <w:tcPr>
+            <w:tcW w:w="3205" w:type="dxa"/>
+            <w:shd w:val="clear" w:color="auto" w:fill="D0CECE" w:themeFill="background2" w:themeFillShade="E6"/>
+          </w:tcPr>
+          <w:p>
+            <w:pPr>
+              <w:ind w:firstLine="0"/>
+              <w:rPr>
+                <w:rFonts w:cs="Times New Roman"/>
+                <w:sz w:val="24"/>
+                <w:szCs w:val="24"/>
+                <w:lang w:val="en-US"/>
+              </w:rPr>
+            </w:pPr>
+            <w:r>
+              <w:rPr>
+                <w:rFonts w:cs="Times New Roman"/>
+                <w:sz w:val="24"/>
+                <w:szCs w:val="24"/>
+                <w:lang w:val="en-US"/>
+              </w:rPr>
+              <w:t xml:space="preserve">{{ </w:t>
+            </w:r>
+            <w:r>
+              <w:rPr>
+                <w:rFonts w:cs="Times New Roman"/>
+                <w:sz w:val="24"/>
+                <w:szCs w:val="24"/>
+                <w:lang w:val="en-US"/>
+              </w:rPr>
+              <w:t>group</w:t>
+            </w:r>
+            <w:r>
+              <w:rPr>
+                <w:rFonts w:cs="Times New Roman"/>
+                <w:sz w:val="24"/>
+                <w:szCs w:val="24"/>
+                <w:lang w:val="en-US"/>
+              </w:rPr>
+              <w:t>.discipline_name</w:t>
+            </w:r>
+            <w:r>
+              <w:rPr>
+                <w:rFonts w:cs="Times New Roman"/>
+                <w:sz w:val="24"/>
+                <w:szCs w:val="24"/>
+                <w:lang w:val="en-US"/>
+              </w:rPr>
+              <w:t xml:space="preserve"> </w:t>
+            </w:r>
+            <w:r>
+              <w:rPr>
+                <w:rFonts w:cs="Times New Roman"/>
+                <w:sz w:val="24"/>
+                <w:szCs w:val="24"/>
+                <w:lang w:val="en-US"/>
+              </w:rPr>
+              <w:t>}}</w:t>
+            </w:r>
+          </w:p>
+        </w:tc>
+        <w:tc>
+          <w:tcPr>
+            <w:tcW w:w="3886" w:type="dxa"/>
+            <w:shd w:val="clear" w:color="auto" w:fill="D0CECE" w:themeFill="background2" w:themeFillShade="E6"/>
+          </w:tcPr>
+          <w:p>
+            <w:pPr>
+              <w:ind w:firstLine="0"/>
+              <w:rPr>
+                <w:rFonts w:cs="Times New Roman"/>
+                <w:sz w:val="24"/>
+                <w:szCs w:val="24"/>
+                <w:lang w:val="en-US"/>
+              </w:rPr>
+            </w:pPr>
+            <w:r>
+              <w:rPr>
+                <w:rFonts w:cs="Times New Roman"/>
+                <w:sz w:val="24"/>
+                <w:szCs w:val="24"/>
+                <w:lang w:val="en-US"/>
+              </w:rPr>
+              <w:t xml:space="preserve">{{ </w:t>
+            </w:r>
+            <w:r>
+              <w:rPr>
+                <w:rFonts w:cs="Times New Roman"/>
+                <w:sz w:val="24"/>
+                <w:szCs w:val="24"/>
+                <w:lang w:val="en-US"/>
+              </w:rPr>
+              <w:t>group</w:t>
+            </w:r>
+            <w:r>
+              <w:rPr>
+                <w:rFonts w:cs="Times New Roman"/>
+                <w:sz w:val="24"/>
+                <w:szCs w:val="24"/>
+                <w:lang w:val="en-US"/>
+              </w:rPr>
+              <w:t>.competence_list | map(attribute='competence_index') | join(', ') }}</w:t>
+            </w:r>
+          </w:p>
+        </w:tc>
+      </w:tr>
+      <w:tr>
+        <w:tc>
+          <w:tcPr>
+            <w:tcW w:w="9628" w:type="dxa"/>
+            <w:gridSpan w:val="3"/>
+            <w:shd w:val="clear" w:color="auto" w:fill="FFFFFF" w:themeFill="background1"/>
+          </w:tcPr>
+          <w:p>
+            <w:pPr>
+              <w:ind w:firstLine="0"/>
+              <w:jc w:val="center"/>
+              <w:rPr>
+                <w:rFonts w:cs="Times New Roman"/>
+                <w:sz w:val="24"/>
+                <w:szCs w:val="24"/>
+                <w:lang w:val="en-US"/>
+              </w:rPr>
+            </w:pPr>
+            <w:r>
+              <w:rPr>
+                <w:rFonts w:cs="Times New Roman"/>
+                <w:sz w:val="24"/>
+                <w:szCs w:val="24"/>
+                <w:lang w:val="en-US"/>
+              </w:rPr>
+              <w:t xml:space="preserve">{%tr for </w:t>
+            </w:r>
+            <w:r>
+              <w:rPr>
+                <w:rFonts w:cs="Times New Roman"/>
+                <w:sz w:val="24"/>
+                <w:szCs w:val="24"/>
+                <w:lang w:val="en-US"/>
+              </w:rPr>
+              <w:t>disc</w:t>
+            </w:r>
+            <w:r>
+              <w:rPr>
+                <w:rFonts w:cs="Times New Roman"/>
+                <w:sz w:val="24"/>
+                <w:szCs w:val="24"/>
+                <w:lang w:val="en-US"/>
+              </w:rPr>
+              <w:t xml:space="preserve"> in </w:t>
+            </w:r>
+            <w:r>
+              <w:rPr>
+                <w:rFonts w:cs="Times New Roman"/>
+                <w:sz w:val="24"/>
+                <w:szCs w:val="24"/>
+                <w:lang w:val="en-US"/>
+              </w:rPr>
+              <w:t>group</w:t>
+            </w:r>
+            <w:r>
+              <w:rPr>
+                <w:rFonts w:cs="Times New Roman"/>
+                <w:sz w:val="24"/>
+                <w:szCs w:val="24"/>
+                <w:lang w:val="en-US"/>
+              </w:rPr>
+              <w:t>.disciplines</w:t>
+            </w:r>
+            <w:r>
+              <w:rPr>
+                <w:rFonts w:cs="Times New Roman"/>
+                <w:sz w:val="24"/>
+                <w:szCs w:val="24"/>
+                <w:lang w:val="en-US"/>
+              </w:rPr>
+              <w:t xml:space="preserve"> </w:t>
             </w:r>
             <w:r>
               <w:rPr>
@@ -2292,7 +2495,6 @@
                 <w:lang w:val="en-US"/>
               </w:rPr>
             </w:pPr>
-            <w:proofErr w:type="gramStart"/>
             <w:r>
               <w:rPr>
                 <w:rFonts w:cs="Times New Roman"/>
@@ -2311,17 +2513,15 @@
               </w:rPr>
               <w:t xml:space="preserve"> </w:t>
             </w:r>
-            <w:proofErr w:type="spellStart"/>
-            <w:r>
-              <w:rPr>
-                <w:rFonts w:cs="Times New Roman"/>
-                <w:sz w:val="24"/>
-                <w:szCs w:val="24"/>
-                <w:lang w:val="en-US"/>
-              </w:rPr>
-              <w:t>item</w:t>
-            </w:r>
-            <w:proofErr w:type="gramEnd"/>
+            <w:r>
+              <w:rPr>
+                <w:rFonts w:cs="Times New Roman"/>
+                <w:sz w:val="24"/>
+                <w:szCs w:val="24"/>
+                <w:lang w:val="en-US"/>
+              </w:rPr>
+              <w:t>disc</w:t>
+            </w:r>
             <w:r>
               <w:rPr>
                 <w:rFonts w:cs="Times New Roman"/>
@@ -2331,7 +2531,6 @@
               </w:rPr>
               <w:t>.discipline_index</w:t>
             </w:r>
-            <w:proofErr w:type="spellEnd"/>
             <w:r>
               <w:rPr>
                 <w:rFonts w:cs="Times New Roman"/>
@@ -2358,7 +2557,6 @@
                 <w:lang w:val="en-US"/>
               </w:rPr>
             </w:pPr>
-            <w:proofErr w:type="gramStart"/>
             <w:r>
               <w:rPr>
                 <w:rFonts w:cs="Times New Roman"/>
@@ -2368,17 +2566,15 @@
               </w:rPr>
               <w:t xml:space="preserve">{{ </w:t>
             </w:r>
-            <w:proofErr w:type="spellStart"/>
-            <w:r>
-              <w:rPr>
-                <w:rFonts w:cs="Times New Roman"/>
-                <w:sz w:val="24"/>
-                <w:szCs w:val="24"/>
-                <w:lang w:val="en-US"/>
-              </w:rPr>
-              <w:t>item</w:t>
-            </w:r>
-            <w:proofErr w:type="gramEnd"/>
+            <w:r>
+              <w:rPr>
+                <w:rFonts w:cs="Times New Roman"/>
+                <w:sz w:val="24"/>
+                <w:szCs w:val="24"/>
+                <w:lang w:val="en-US"/>
+              </w:rPr>
+              <w:t>disc</w:t>
+            </w:r>
             <w:r>
               <w:rPr>
                 <w:rFonts w:cs="Times New Roman"/>
@@ -2388,7 +2584,6 @@
               </w:rPr>
               <w:t>.discipline_name</w:t>
             </w:r>
-            <w:proofErr w:type="spellEnd"/>
             <w:r>
               <w:rPr>
                 <w:rFonts w:cs="Times New Roman"/>
@@ -2424,7 +2619,6 @@
                 <w:lang w:val="en-US"/>
               </w:rPr>
             </w:pPr>
-            <w:proofErr w:type="gramStart"/>
             <w:r>
               <w:rPr>
                 <w:rFonts w:cs="Times New Roman"/>
@@ -2434,75 +2628,53 @@
               </w:rPr>
               <w:t xml:space="preserve">{{ </w:t>
             </w:r>
-            <w:proofErr w:type="spellStart"/>
-            <w:r>
-              <w:rPr>
-                <w:rFonts w:cs="Times New Roman"/>
-                <w:sz w:val="24"/>
-                <w:szCs w:val="24"/>
-                <w:lang w:val="en-US"/>
-              </w:rPr>
-              <w:t>item</w:t>
-            </w:r>
-            <w:proofErr w:type="gramEnd"/>
-            <w:r>
-              <w:rPr>
-                <w:rFonts w:cs="Times New Roman"/>
-                <w:sz w:val="24"/>
-                <w:szCs w:val="24"/>
-                <w:lang w:val="en-US"/>
-              </w:rPr>
-              <w:t>.competence_list</w:t>
-            </w:r>
-            <w:proofErr w:type="spellEnd"/>
-            <w:r>
-              <w:rPr>
-                <w:rFonts w:cs="Times New Roman"/>
-                <w:sz w:val="24"/>
-                <w:szCs w:val="24"/>
-                <w:lang w:val="en-US"/>
-              </w:rPr>
-              <w:t xml:space="preserve"> | map(attribute='</w:t>
-            </w:r>
-            <w:proofErr w:type="spellStart"/>
-            <w:r>
-              <w:rPr>
-                <w:rFonts w:cs="Times New Roman"/>
-                <w:sz w:val="24"/>
-                <w:szCs w:val="24"/>
-                <w:lang w:val="en-US"/>
-              </w:rPr>
-              <w:t>competence_index</w:t>
-            </w:r>
-            <w:proofErr w:type="spellEnd"/>
-            <w:r>
-              <w:rPr>
-                <w:rFonts w:cs="Times New Roman"/>
-                <w:sz w:val="24"/>
-                <w:szCs w:val="24"/>
-                <w:lang w:val="en-US"/>
-              </w:rPr>
-              <w:t xml:space="preserve">') | </w:t>
-            </w:r>
-            <w:proofErr w:type="gramStart"/>
-            <w:r>
-              <w:rPr>
-                <w:rFonts w:cs="Times New Roman"/>
-                <w:sz w:val="24"/>
-                <w:szCs w:val="24"/>
-                <w:lang w:val="en-US"/>
-              </w:rPr>
-              <w:t>join(</w:t>
-            </w:r>
-            <w:proofErr w:type="gramEnd"/>
-            <w:r>
-              <w:rPr>
-                <w:rFonts w:cs="Times New Roman"/>
-                <w:sz w:val="24"/>
-                <w:szCs w:val="24"/>
-                <w:lang w:val="en-US"/>
-              </w:rPr>
-              <w:t>', ') }}</w:t>
+            <w:r>
+              <w:rPr>
+                <w:rFonts w:cs="Times New Roman"/>
+                <w:sz w:val="24"/>
+                <w:szCs w:val="24"/>
+                <w:lang w:val="en-US"/>
+              </w:rPr>
+              <w:t>disc</w:t>
+            </w:r>
+            <w:r>
+              <w:rPr>
+                <w:rFonts w:cs="Times New Roman"/>
+                <w:sz w:val="24"/>
+                <w:szCs w:val="24"/>
+                <w:lang w:val="en-US"/>
+              </w:rPr>
+              <w:t>.competence_list | map(attribute='competence_index') | join(', ') }}</w:t>
+            </w:r>
+          </w:p>
+        </w:tc>
+      </w:tr>
+      <w:tr>
+        <w:tc>
+          <w:tcPr>
+            <w:tcW w:w="9628" w:type="dxa"/>
+            <w:gridSpan w:val="3"/>
+            <w:shd w:val="clear" w:color="auto" w:fill="FFFFFF" w:themeFill="background1"/>
+          </w:tcPr>
+          <w:p>
+            <w:pPr>
+              <w:ind w:firstLine="0"/>
+              <w:jc w:val="center"/>
+              <w:rPr>
+                <w:rFonts w:cs="Times New Roman"/>
+                <w:sz w:val="24"/>
+                <w:szCs w:val="24"/>
+                <w:lang w:val="en-US"/>
+              </w:rPr>
+            </w:pPr>
+            <w:r>
+              <w:rPr>
+                <w:rFonts w:cs="Times New Roman"/>
+                <w:sz w:val="24"/>
+                <w:szCs w:val="24"/>
+                <w:lang w:val="en-US"/>
+              </w:rPr>
+              <w:t>{%tr endfor %}</w:t>
             </w:r>
           </w:p>
         </w:tc>
@@ -2530,27 +2702,7 @@
                 <w:szCs w:val="24"/>
                 <w:lang w:val="en-US"/>
               </w:rPr>
-              <w:t xml:space="preserve">{%tr </w:t>
-            </w:r>
-            <w:proofErr w:type="spellStart"/>
-            <w:r>
-              <w:rPr>
-                <w:rFonts w:cs="Times New Roman"/>
-                <w:sz w:val="24"/>
-                <w:szCs w:val="24"/>
-                <w:lang w:val="en-US"/>
-              </w:rPr>
-              <w:t>endfor</w:t>
-            </w:r>
-            <w:proofErr w:type="spellEnd"/>
-            <w:r>
-              <w:rPr>
-                <w:rFonts w:cs="Times New Roman"/>
-                <w:sz w:val="24"/>
-                <w:szCs w:val="24"/>
-                <w:lang w:val="en-US"/>
-              </w:rPr>
-              <w:t xml:space="preserve"> %}</w:t>
+              <w:t>{%tr endfor %}</w:t>
             </w:r>
           </w:p>
         </w:tc>

</xml_diff>